<commit_message>
feat: extract VPP requester name dynamically from document and fill it in word template
</commit_message>
<xml_diff>
--- a/dashboard/public/templates/phieu_cap_phat_vpp.docx
+++ b/dashboard/public/templates/phieu_cap_phat_vpp.docx
@@ -355,9 +355,10 @@
         <w:t>sau</w:t>
       </w:r>
       <w:proofErr w:type="spellEnd"/>
+      <w:r>
+        <w:t>:</w:t>
+      </w:r>
     </w:p>
-    <w:p/>
-    <w:p/>
     <w:tbl>
       <w:tblPr>
         <w:tblStyle w:val="TableGrid"/>

</xml_diff>